<commit_message>
Release v1.3.0: G4 validation-harness robustness (strong-baseline, spec-curve, movie red-team)
Co-Authored-By: Claude Opus 4.8 <noreply@anthropic.com>
</commit_message>
<xml_diff>
--- a/manuscript/MANUSCRIPT_amygdala-false-floor_v2.docx
+++ b/manuscript/MANUSCRIPT_amygdala-false-floor_v2.docx
@@ -2,7 +2,7 @@
 <file path=word/document.xml><?xml version="1.0" encoding="utf-8"?>
 <w:document xmlns:w="http://schemas.openxmlformats.org/wordprocessingml/2006/main" xmlns:m="http://schemas.openxmlformats.org/officeDocument/2006/math" xmlns:r="http://schemas.openxmlformats.org/officeDocument/2006/relationships" xmlns:o="urn:schemas-microsoft-com:office:office" xmlns:v="urn:schemas-microsoft-com:vml" xmlns:w10="urn:schemas-microsoft-com:office:word" xmlns:a="http://schemas.openxmlformats.org/drawingml/2006/main" xmlns:pic="http://schemas.openxmlformats.org/drawingml/2006/picture" xmlns:wp="http://schemas.openxmlformats.org/drawingml/2006/wordprocessingDrawing">
   <w:body>
-    <w:bookmarkStart w:id="50" w:name="Xf2d9390897e87c3d33922e033ee5b5299e9ff39"/>
+    <w:bookmarkStart w:id="51" w:name="Xf2d9390897e87c3d33922e033ee5b5299e9ff39"/>
     <w:p>
       <w:pPr>
         <w:pStyle w:val="Heading1"/>
@@ -639,6 +639,62 @@
         <w:pStyle w:val="BodyText"/>
       </w:pPr>
       <w:r>
+        <w:t xml:space="preserve">A strong-baseline test confirmed that this small increment is not a weak-generic-encoder artifact: EmoNet retained</w:t>
+      </w:r>
+      <w:r>
+        <w:t xml:space="preserve"> </w:t>
+      </w:r>
+      <w:r>
+        <w:t xml:space="preserve">a unique increment over the strongest generic encoder, DINOv2, in the amygdala (EmoNet minus DINOv2 +0.0021 left,</w:t>
+      </w:r>
+      <w:r>
+        <w:t xml:space="preserve"> </w:t>
+      </w:r>
+      <w:r>
+        <w:t xml:space="preserve">+0.0015 right, both p&lt;.001), even larger than its increment over ResNet. This sharpens rather than softens the</w:t>
+      </w:r>
+      <w:r>
+        <w:t xml:space="preserve"> </w:t>
+      </w:r>
+      <w:r>
+        <w:t xml:space="preserve">reading. The movie amygdala robustly meets criterion (A) — a construct encoder beating even a strong non-construct</w:t>
+      </w:r>
+      <w:r>
+        <w:t xml:space="preserve"> </w:t>
+      </w:r>
+      <w:r>
+        <w:t xml:space="preserve">encoder — but still fails criterion (B), because the second affect encoder does not reproduce it and the two affect</w:t>
+      </w:r>
+      <w:r>
+        <w:t xml:space="preserve"> </w:t>
+      </w:r>
+      <w:r>
+        <w:t xml:space="preserve">encoders do not converge; a signal that survives strong generic baselines yet is not affect-encoder-invariant is</w:t>
+      </w:r>
+      <w:r>
+        <w:t xml:space="preserve"> </w:t>
+      </w:r>
+      <w:r>
+        <w:t xml:space="preserve">precisely the encoder-specific, not construct-specific, pattern the invariance test is built to expose. The</w:t>
+      </w:r>
+      <w:r>
+        <w:t xml:space="preserve"> </w:t>
+      </w:r>
+      <w:r>
+        <w:t xml:space="preserve">increment also remains several-fold smaller than in the fusiform positive control, where EmoNet beats DINOv2 by</w:t>
+      </w:r>
+      <w:r>
+        <w:t xml:space="preserve"> </w:t>
+      </w:r>
+      <w:r>
+        <w:t xml:space="preserve">+0.0079 (Methods 4.11).</w:t>
+      </w:r>
+    </w:p>
+    <w:p>
+      <w:pPr>
+        <w:pStyle w:val="BodyText"/>
+      </w:pPr>
+      <w:r>
         <w:t xml:space="preserve">The honest movie-arm claim is therefore not a clean absence of an image-computable affect code in the amygdala,</w:t>
       </w:r>
       <w:r>
@@ -1040,6 +1096,116 @@
       </w:r>
       <w:r>
         <w:t xml:space="preserve">per-session amygdala contrasts, with the bounded-null comparison as a secondary check that holds in either frame.</w:t>
+      </w:r>
+    </w:p>
+    <w:p>
+      <w:pPr>
+        <w:pStyle w:val="BodyText"/>
+      </w:pPr>
+      <w:r>
+        <w:rPr>
+          <w:b/>
+          <w:bCs/>
+        </w:rPr>
+        <w:t xml:space="preserve">Strong-baseline robustness (representation invariance).</w:t>
+      </w:r>
+      <w:r>
+        <w:t xml:space="preserve"> </w:t>
+      </w:r>
+      <w:r>
+        <w:t xml:space="preserve">A negative claim is only as strong as the strongest</w:t>
+      </w:r>
+      <w:r>
+        <w:t xml:space="preserve"> </w:t>
+      </w:r>
+      <w:r>
+        <w:t xml:space="preserve">baseline that fails to beat it, so we re-ran the anchor RSA with paradigmatically different, stronger frozen encoders</w:t>
+      </w:r>
+      <w:r>
+        <w:t xml:space="preserve"> </w:t>
+      </w:r>
+      <w:r>
+        <w:t xml:space="preserve">on both sides: two stronger generic encoders (DINOv2, self-distilled; CLIP ViT-B/32, contrastive) and a modern</w:t>
+      </w:r>
+      <w:r>
+        <w:t xml:space="preserve"> </w:t>
+      </w:r>
+      <w:r>
+        <w:t xml:space="preserve">facial-expression network as a stronger affect encoder. The strongest generic encoder (DINOv2) matched the amygdala</w:t>
+      </w:r>
+      <w:r>
+        <w:t xml:space="preserve"> </w:t>
+      </w:r>
+      <w:r>
+        <w:t xml:space="preserve">single-neuron geometry as well as the object encoders (RSA +0.592, versus ViT +0.592) and better than either affect</w:t>
+      </w:r>
+      <w:r>
+        <w:t xml:space="preserve"> </w:t>
+      </w:r>
+      <w:r>
+        <w:t xml:space="preserve">encoder, while the modern affect encoder matched it worse (+0.140), so the affect encoders used here are not weak</w:t>
+      </w:r>
+      <w:r>
+        <w:t xml:space="preserve"> </w:t>
+      </w:r>
+      <w:r>
+        <w:t xml:space="preserve">strawmen. The affect(best)−object(best) deficit held across all four encoder configurations and, if anything,</w:t>
+      </w:r>
+      <w:r>
+        <w:t xml:space="preserve"> </w:t>
+      </w:r>
+      <w:r>
+        <w:t xml:space="preserve">strengthened under the stronger generic encoders (−0.086 with the original panel, −0.088 adding DINOv2 and CLIP,</w:t>
+      </w:r>
+      <w:r>
+        <w:t xml:space="preserve"> </w:t>
+      </w:r>
+      <w:r>
+        <w:t xml:space="preserve">−0.084 adding the stronger affect encoder, −0.091 with stronger encoders on both sides; all bootstrap-p&lt;.05). The</w:t>
+      </w:r>
+      <w:r>
+        <w:t xml:space="preserve"> </w:t>
+      </w:r>
+      <w:r>
+        <w:t xml:space="preserve">verdict is therefore robust to encoder strength rather than an artifact of a weak affect probe (Methods 4.11).</w:t>
+      </w:r>
+    </w:p>
+    <w:p>
+      <w:pPr>
+        <w:pStyle w:val="BodyText"/>
+      </w:pPr>
+      <w:r>
+        <w:t xml:space="preserve">We further ran a specification-curve (multiverse) over the anchor verdict across 136 defensible analytic choices for</w:t>
+      </w:r>
+      <w:r>
+        <w:t xml:space="preserve"> </w:t>
+      </w:r>
+      <w:r>
+        <w:t xml:space="preserve">the pooled and left-amygdala samples — encoder set (original, plus the stronger encoders), best-of aggregation</w:t>
+      </w:r>
+      <w:r>
+        <w:t xml:space="preserve"> </w:t>
+      </w:r>
+      <w:r>
+        <w:t xml:space="preserve">(max/mean), RDM metric (correlation, Spearman, Euclidean), and neural-pattern normalization — and the</w:t>
+      </w:r>
+      <w:r>
+        <w:t xml:space="preserve"> </w:t>
+      </w:r>
+      <w:r>
+        <w:t xml:space="preserve">affect(best)−object(best) contrast was negative in 100% of them (median −0.11; Figure S1). No analytic choice</w:t>
+      </w:r>
+      <w:r>
+        <w:t xml:space="preserve"> </w:t>
+      </w:r>
+      <w:r>
+        <w:t xml:space="preserve">reversed the sign; the only large mover was hemisphere (the right amygdala is null, as reported). The single-neuron</w:t>
+      </w:r>
+      <w:r>
+        <w:t xml:space="preserve"> </w:t>
+      </w:r>
+      <w:r>
+        <w:t xml:space="preserve">verdict is thus robust across the multiverse of reasonable pipelines, not an artifact of the specific one (Methods 4.11).</w:t>
       </w:r>
     </w:p>
     <w:p>
@@ -1704,7 +1870,7 @@
       </w:r>
     </w:p>
     <w:bookmarkEnd w:id="17"/>
-    <w:bookmarkStart w:id="28" w:name="methods"/>
+    <w:bookmarkStart w:id="29" w:name="methods"/>
     <w:p>
       <w:pPr>
         <w:pStyle w:val="Heading2"/>
@@ -3840,6 +4006,138 @@
         <w:t xml:space="preserve">header). The complete analysis code is provided; the feature-extraction step is supplied as a reference implementation that reproduces the pipeline and all qualitative verdicts (signs, significance, the amygdala affect-object comparison, and the equivalence bound). As with any fMRI pipeline, exact numerical reproduction across compute environments is not expected (BLAS/GPU/MPS differences); the original encoder feature caches were lost and were regenerated with a reference extractor (this includes the movie random-encoder features, previously regenerated in place of the original projection seed), and the verdict reproduces at the group level under the regenerated caches. All analysis code, per-analysis result logs, and a reproducibility runner are openly available at https://github.com/patrickiben/amygdala-invariance and archived at Zenodo (doi:10.5281/zenodo.21367398). Public inputs: OpenNeuro ds002837 [8]; OSF 26RHZ [10]; EmoNet weights (OSF amdju); the Toisoul face-EmoNet weights (GitHub); torchvision weights; and the audeering wav2vec2 checkpoint (HuggingFace).</w:t>
       </w:r>
     </w:p>
+    <w:bookmarkEnd w:id="27"/>
+    <w:bookmarkStart w:id="28" w:name="strong-baseline-red-team"/>
+    <w:p>
+      <w:pPr>
+        <w:pStyle w:val="Heading3"/>
+      </w:pPr>
+      <w:r>
+        <w:t xml:space="preserve">4.11 Strong-baseline red-team</w:t>
+      </w:r>
+    </w:p>
+    <w:p>
+      <w:pPr>
+        <w:pStyle w:val="FirstParagraph"/>
+      </w:pPr>
+      <w:r>
+        <w:t xml:space="preserve">To test whether the single-neuron negative inherits weak encoders, we added paradigmatically different stronger frozen encoders and re-ran the pseudo-population RSA. Generic: DINOv2-base (</w:t>
+      </w:r>
+      <w:r>
+        <w:rPr>
+          <w:rStyle w:val="VerbatimChar"/>
+        </w:rPr>
+        <w:t xml:space="preserve">facebook/dinov2-base</w:t>
+      </w:r>
+      <w:r>
+        <w:t xml:space="preserve">, CLS token, 768-d) and CLIP ViT-B/32 (</w:t>
+      </w:r>
+      <w:r>
+        <w:rPr>
+          <w:rStyle w:val="VerbatimChar"/>
+        </w:rPr>
+        <w:t xml:space="preserve">openai/clip-vit-base-patch32</w:t>
+      </w:r>
+      <w:r>
+        <w:t xml:space="preserve">, projected image embedding, 512-d). Affect: a facial-expression ViT (</w:t>
+      </w:r>
+      <w:r>
+        <w:rPr>
+          <w:rStyle w:val="VerbatimChar"/>
+        </w:rPr>
+        <w:t xml:space="preserve">trpakov/vit-face-expression</w:t>
+      </w:r>
+      <w:r>
+        <w:t xml:space="preserve">, penultimate CLS, 768-d). Features were extracted on the seven morph levels exactly as in 4.2, RDMs and Spearman RSA computed as in 4.4, and the affect(best)−object(best) bootstrap contrast (4.5) recomputed for four encoder configurations (original; +stronger generic; +stronger affect; both). The load-bearing conclusion is the generic-side result (a stronger generic encoder matches the amygdala geometry at least as well as the affect encoders) and the representation-invariance across paradigmatically different affect encoders, not that this facial-expression network is the strongest possible affect probe. Script and log:</w:t>
+      </w:r>
+      <w:r>
+        <w:t xml:space="preserve"> </w:t>
+      </w:r>
+      <w:r>
+        <w:rPr>
+          <w:rStyle w:val="VerbatimChar"/>
+        </w:rPr>
+        <w:t xml:space="preserve">real_data/scripts/reanalysis/strong_baseline_rsa.py</w:t>
+      </w:r>
+      <w:r>
+        <w:t xml:space="preserve"> </w:t>
+      </w:r>
+      <w:r>
+        <w:t xml:space="preserve">-&gt;</w:t>
+      </w:r>
+      <w:r>
+        <w:t xml:space="preserve"> </w:t>
+      </w:r>
+      <w:r>
+        <w:rPr>
+          <w:rStyle w:val="VerbatimChar"/>
+        </w:rPr>
+        <w:t xml:space="preserve">results/strong_baseline_result.txt</w:t>
+      </w:r>
+      <w:r>
+        <w:t xml:space="preserve">. As a companion multiverse, a specification-curve varied the encoder set, the best-of aggregation (max/mean), the RDM metric (1−Pearson correlation, Spearman, Euclidean), and the neural-pattern normalization over the pooled and left-amygdala samples — analytic choices classified as principled-equivalent (Type E) or uncertain (Type U), with hemisphere reported as a separate facet — and recomputed the affect(best)−object(best) sign for each defensible specification (</w:t>
+      </w:r>
+      <w:r>
+        <w:rPr>
+          <w:rStyle w:val="VerbatimChar"/>
+        </w:rPr>
+        <w:t xml:space="preserve">spec_curve.py</w:t>
+      </w:r>
+      <w:r>
+        <w:t xml:space="preserve"> </w:t>
+      </w:r>
+      <w:r>
+        <w:t xml:space="preserve">-&gt;</w:t>
+      </w:r>
+      <w:r>
+        <w:t xml:space="preserve"> </w:t>
+      </w:r>
+      <w:r>
+        <w:rPr>
+          <w:rStyle w:val="VerbatimChar"/>
+        </w:rPr>
+        <w:t xml:space="preserve">results/spec_curve_result.txt</w:t>
+      </w:r>
+      <w:r>
+        <w:t xml:space="preserve">,</w:t>
+      </w:r>
+      <w:r>
+        <w:t xml:space="preserve"> </w:t>
+      </w:r>
+      <w:r>
+        <w:rPr>
+          <w:rStyle w:val="VerbatimChar"/>
+        </w:rPr>
+        <w:t xml:space="preserve">figures/FigS1_spec_curve.png</w:t>
+      </w:r>
+      <w:r>
+        <w:t xml:space="preserve">). For the movie arm, the same stronger generic encoders were run through the PLS variance-partition pipeline (4.3): per participant, EmoNet-minus-DINOv2 = R2([emonet,vit]) minus R2([dinov2,vit]) for the L/R amygdala and fusiform, testing whether the amygdala’s small EmoNet increment survives the strongest generic baseline (</w:t>
+      </w:r>
+      <w:r>
+        <w:rPr>
+          <w:rStyle w:val="VerbatimChar"/>
+        </w:rPr>
+        <w:t xml:space="preserve">movie_strongbaseline.py</w:t>
+      </w:r>
+      <w:r>
+        <w:t xml:space="preserve"> </w:t>
+      </w:r>
+      <w:r>
+        <w:t xml:space="preserve">-&gt;</w:t>
+      </w:r>
+      <w:r>
+        <w:t xml:space="preserve"> </w:t>
+      </w:r>
+      <w:r>
+        <w:rPr>
+          <w:rStyle w:val="VerbatimChar"/>
+        </w:rPr>
+        <w:t xml:space="preserve">results/movie_strongbaseline_result.txt</w:t>
+      </w:r>
+      <w:r>
+        <w:t xml:space="preserve">).</w:t>
+      </w:r>
+    </w:p>
     <w:p>
       <w:r>
         <w:pict>
@@ -3847,9 +4145,9 @@
         </w:pict>
       </w:r>
     </w:p>
-    <w:bookmarkEnd w:id="27"/>
     <w:bookmarkEnd w:id="28"/>
-    <w:bookmarkStart w:id="29" w:name="limitations"/>
+    <w:bookmarkEnd w:id="29"/>
+    <w:bookmarkStart w:id="30" w:name="limitations"/>
     <w:p>
       <w:pPr>
         <w:pStyle w:val="Heading2"/>
@@ -4219,25 +4517,43 @@
           <w:b/>
           <w:bCs/>
         </w:rPr>
-        <w:t xml:space="preserve">The single-neuron null is for image-computable codes.</w:t>
-      </w:r>
-      <w:r>
-        <w:t xml:space="preserve"> </w:t>
-      </w:r>
-      <w:r>
-        <w:t xml:space="preserve">It does not exclude an emotion code recoverable from</w:t>
-      </w:r>
-      <w:r>
-        <w:t xml:space="preserve"> </w:t>
-      </w:r>
-      <w:r>
-        <w:t xml:space="preserve">population geometry of experimenter-defined states under a task (O’Neill, Posani et al., 2026 [12], mouse). Testing</w:t>
-      </w:r>
-      <w:r>
-        <w:t xml:space="preserve"> </w:t>
-      </w:r>
-      <w:r>
-        <w:t xml:space="preserve">cross-condition population-geometry decodability in these 442 units is the most important next analysis.</w:t>
+        <w:t xml:space="preserve">The negative survives a strong-baseline red-team.</w:t>
+      </w:r>
+      <w:r>
+        <w:t xml:space="preserve"> </w:t>
+      </w:r>
+      <w:r>
+        <w:t xml:space="preserve">Because a limitation claim inherits the strength of its</w:t>
+      </w:r>
+      <w:r>
+        <w:t xml:space="preserve"> </w:t>
+      </w:r>
+      <w:r>
+        <w:t xml:space="preserve">strongest-failing baseline, we tested the amygdala verdict against paradigmatically different stronger encoders</w:t>
+      </w:r>
+      <w:r>
+        <w:t xml:space="preserve"> </w:t>
+      </w:r>
+      <w:r>
+        <w:t xml:space="preserve">(DINOv2, CLIP; a modern facial-expression network). The affect–object deficit was robust and if anything</w:t>
+      </w:r>
+      <w:r>
+        <w:t xml:space="preserve"> </w:t>
+      </w:r>
+      <w:r>
+        <w:t xml:space="preserve">strengthened, and the modern affect encoder matched the geometry worse than EmoNet/Toisoul, so the negative is not</w:t>
+      </w:r>
+      <w:r>
+        <w:t xml:space="preserve"> </w:t>
+      </w:r>
+      <w:r>
+        <w:t xml:space="preserve">a weak-affect-encoder artifact — the representation-invariance test the paper applies to others, turned on its own</w:t>
+      </w:r>
+      <w:r>
+        <w:t xml:space="preserve"> </w:t>
+      </w:r>
+      <w:r>
+        <w:t xml:space="preserve">claim (§2.3, Methods 4.11).</w:t>
       </w:r>
     </w:p>
     <w:p>
@@ -4253,31 +4569,25 @@
           <w:b/>
           <w:bCs/>
         </w:rPr>
-        <w:t xml:space="preserve">Stimulus dimensionality.</w:t>
-      </w:r>
-      <w:r>
-        <w:t xml:space="preserve"> </w:t>
-      </w:r>
-      <w:r>
-        <w:t xml:space="preserve">The face-morph datasets are 1-D continua, so affect versus low-level dissociate</w:t>
-      </w:r>
-      <w:r>
-        <w:t xml:space="preserve"> </w:t>
-      </w:r>
-      <w:r>
-        <w:t xml:space="preserve">only in multivariate geometry; the finding that object and low-level encoders match the amygdala geometry better</w:t>
-      </w:r>
-      <w:r>
-        <w:t xml:space="preserve"> </w:t>
-      </w:r>
-      <w:r>
-        <w:t xml:space="preserve">than affect encoders is the wrong direction for a true emotion code, but a higher-dimensional emotional-stimulus</w:t>
-      </w:r>
-      <w:r>
-        <w:t xml:space="preserve"> </w:t>
-      </w:r>
-      <w:r>
-        <w:t xml:space="preserve">battery would strengthen it.</w:t>
+        <w:t xml:space="preserve">The single-neuron null is for image-computable codes.</w:t>
+      </w:r>
+      <w:r>
+        <w:t xml:space="preserve"> </w:t>
+      </w:r>
+      <w:r>
+        <w:t xml:space="preserve">It does not exclude an emotion code recoverable from</w:t>
+      </w:r>
+      <w:r>
+        <w:t xml:space="preserve"> </w:t>
+      </w:r>
+      <w:r>
+        <w:t xml:space="preserve">population geometry of experimenter-defined states under a task (O’Neill, Posani et al., 2026 [12], mouse). Testing</w:t>
+      </w:r>
+      <w:r>
+        <w:t xml:space="preserve"> </w:t>
+      </w:r>
+      <w:r>
+        <w:t xml:space="preserve">cross-condition population-geometry decodability in these 442 units is the most important next analysis.</w:t>
       </w:r>
     </w:p>
     <w:p>
@@ -4293,19 +4603,31 @@
           <w:b/>
           <w:bCs/>
         </w:rPr>
-        <w:t xml:space="preserve">Two encoders per construct</w:t>
-      </w:r>
-      <w:r>
-        <w:t xml:space="preserve"> </w:t>
-      </w:r>
-      <w:r>
-        <w:t xml:space="preserve">for the image arms; the audio arm has one affect encoder and so does not meet</w:t>
-      </w:r>
-      <w:r>
-        <w:t xml:space="preserve"> </w:t>
-      </w:r>
-      <w:r>
-        <w:t xml:space="preserve">criterion (B). Vision-only for the image analyses; the audio encoder is prosody-trained.</w:t>
+        <w:t xml:space="preserve">Stimulus dimensionality.</w:t>
+      </w:r>
+      <w:r>
+        <w:t xml:space="preserve"> </w:t>
+      </w:r>
+      <w:r>
+        <w:t xml:space="preserve">The face-morph datasets are 1-D continua, so affect versus low-level dissociate</w:t>
+      </w:r>
+      <w:r>
+        <w:t xml:space="preserve"> </w:t>
+      </w:r>
+      <w:r>
+        <w:t xml:space="preserve">only in multivariate geometry; the finding that object and low-level encoders match the amygdala geometry better</w:t>
+      </w:r>
+      <w:r>
+        <w:t xml:space="preserve"> </w:t>
+      </w:r>
+      <w:r>
+        <w:t xml:space="preserve">than affect encoders is the wrong direction for a true emotion code, but a higher-dimensional emotional-stimulus</w:t>
+      </w:r>
+      <w:r>
+        <w:t xml:space="preserve"> </w:t>
+      </w:r>
+      <w:r>
+        <w:t xml:space="preserve">battery would strengthen it.</w:t>
       </w:r>
     </w:p>
     <w:p>
@@ -4321,13 +4643,19 @@
           <w:b/>
           <w:bCs/>
         </w:rPr>
-        <w:t xml:space="preserve">Pseudo-population</w:t>
-      </w:r>
-      <w:r>
-        <w:t xml:space="preserve"> </w:t>
-      </w:r>
-      <w:r>
-        <w:t xml:space="preserve">single-neuron matrices pool across patients; corroborated by per-session tests.</w:t>
+        <w:t xml:space="preserve">Two encoders per construct</w:t>
+      </w:r>
+      <w:r>
+        <w:t xml:space="preserve"> </w:t>
+      </w:r>
+      <w:r>
+        <w:t xml:space="preserve">for the image arms; the audio arm has one affect encoder and so does not meet</w:t>
+      </w:r>
+      <w:r>
+        <w:t xml:space="preserve"> </w:t>
+      </w:r>
+      <w:r>
+        <w:t xml:space="preserve">criterion (B). Vision-only for the image analyses; the audio encoder is prosody-trained.</w:t>
       </w:r>
     </w:p>
     <w:p>
@@ -4343,25 +4671,13 @@
           <w:b/>
           <w:bCs/>
         </w:rPr>
-        <w:t xml:space="preserve">Shared stimulus.</w:t>
-      </w:r>
-      <w:r>
-        <w:t xml:space="preserve"> </w:t>
-      </w:r>
-      <w:r>
-        <w:t xml:space="preserve">The face-morph fMRI and single-neuron arms use the same seven-level morph stimulus, so</w:t>
-      </w:r>
-      <w:r>
-        <w:t xml:space="preserve"> </w:t>
-      </w:r>
-      <w:r>
-        <w:t xml:space="preserve">they are one stimulus measured two ways rather than independent replications; the naturalistic-movie arm is the</w:t>
-      </w:r>
-      <w:r>
-        <w:t xml:space="preserve"> </w:t>
-      </w:r>
-      <w:r>
-        <w:t xml:space="preserve">only fully independent dataset.</w:t>
+        <w:t xml:space="preserve">Pseudo-population</w:t>
+      </w:r>
+      <w:r>
+        <w:t xml:space="preserve"> </w:t>
+      </w:r>
+      <w:r>
+        <w:t xml:space="preserve">single-neuron matrices pool across patients; corroborated by per-session tests.</w:t>
       </w:r>
     </w:p>
     <w:p>
@@ -4377,10 +4693,25 @@
           <w:b/>
           <w:bCs/>
         </w:rPr>
-        <w:t xml:space="preserve">Interoception untested</w:t>
-      </w:r>
-      <w:r>
-        <w:t xml:space="preserve">, and not encoder-shaped.</w:t>
+        <w:t xml:space="preserve">Shared stimulus.</w:t>
+      </w:r>
+      <w:r>
+        <w:t xml:space="preserve"> </w:t>
+      </w:r>
+      <w:r>
+        <w:t xml:space="preserve">The face-morph fMRI and single-neuron arms use the same seven-level morph stimulus, so</w:t>
+      </w:r>
+      <w:r>
+        <w:t xml:space="preserve"> </w:t>
+      </w:r>
+      <w:r>
+        <w:t xml:space="preserve">they are one stimulus measured two ways rather than independent replications; the naturalistic-movie arm is the</w:t>
+      </w:r>
+      <w:r>
+        <w:t xml:space="preserve"> </w:t>
+      </w:r>
+      <w:r>
+        <w:t xml:space="preserve">only fully independent dataset.</w:t>
       </w:r>
     </w:p>
     <w:p>
@@ -4396,48 +4727,10 @@
           <w:b/>
           <w:bCs/>
         </w:rPr>
-        <w:t xml:space="preserve">Dataset scope.</w:t>
-      </w:r>
-      <w:r>
-        <w:t xml:space="preserve"> </w:t>
-      </w:r>
-      <w:r>
-        <w:t xml:space="preserve">A well-powered shared-stimulus emotion-</w:t>
-      </w:r>
-      <w:r>
-        <w:rPr>
-          <w:i/>
-          <w:iCs/>
-        </w:rPr>
-        <w:t xml:space="preserve">movie</w:t>
-      </w:r>
-      <w:r>
-        <w:t xml:space="preserve"> </w:t>
-      </w:r>
-      <w:r>
-        <w:t xml:space="preserve">dataset with timepoint-level annotations now</w:t>
-      </w:r>
-      <w:r>
-        <w:t xml:space="preserve"> </w:t>
-      </w:r>
-      <w:r>
-        <w:t xml:space="preserve">exists (Emo-FilM, Morgenroth et al., 2025 [19]) and is an obvious replication target; the genuine gap is a</w:t>
-      </w:r>
-      <w:r>
-        <w:t xml:space="preserve"> </w:t>
-      </w:r>
-      <w:r>
-        <w:t xml:space="preserve">well-powered, diverse-emotional-</w:t>
-      </w:r>
-      <w:r>
-        <w:rPr>
-          <w:i/>
-          <w:iCs/>
-        </w:rPr>
-        <w:t xml:space="preserve">image</w:t>
-      </w:r>
-      <w:r>
-        <w:t xml:space="preserve">, single-trial dataset with amygdala coverage and shared stimuli.</w:t>
+        <w:t xml:space="preserve">Interoception untested</w:t>
+      </w:r>
+      <w:r>
+        <w:t xml:space="preserve">, and not encoder-shaped.</w:t>
       </w:r>
     </w:p>
     <w:p>
@@ -4453,6 +4746,63 @@
           <w:b/>
           <w:bCs/>
         </w:rPr>
+        <w:t xml:space="preserve">Dataset scope.</w:t>
+      </w:r>
+      <w:r>
+        <w:t xml:space="preserve"> </w:t>
+      </w:r>
+      <w:r>
+        <w:t xml:space="preserve">A well-powered shared-stimulus emotion-</w:t>
+      </w:r>
+      <w:r>
+        <w:rPr>
+          <w:i/>
+          <w:iCs/>
+        </w:rPr>
+        <w:t xml:space="preserve">movie</w:t>
+      </w:r>
+      <w:r>
+        <w:t xml:space="preserve"> </w:t>
+      </w:r>
+      <w:r>
+        <w:t xml:space="preserve">dataset with timepoint-level annotations now</w:t>
+      </w:r>
+      <w:r>
+        <w:t xml:space="preserve"> </w:t>
+      </w:r>
+      <w:r>
+        <w:t xml:space="preserve">exists (Emo-FilM, Morgenroth et al., 2025 [19]) and is an obvious replication target; the genuine gap is a</w:t>
+      </w:r>
+      <w:r>
+        <w:t xml:space="preserve"> </w:t>
+      </w:r>
+      <w:r>
+        <w:t xml:space="preserve">well-powered, diverse-emotional-</w:t>
+      </w:r>
+      <w:r>
+        <w:rPr>
+          <w:i/>
+          <w:iCs/>
+        </w:rPr>
+        <w:t xml:space="preserve">image</w:t>
+      </w:r>
+      <w:r>
+        <w:t xml:space="preserve">, single-trial dataset with amygdala coverage and shared stimuli.</w:t>
+      </w:r>
+    </w:p>
+    <w:p>
+      <w:pPr>
+        <w:pStyle w:val="Compact"/>
+        <w:numPr>
+          <w:ilvl w:val="0"/>
+          <w:numId w:val="1003"/>
+        </w:numPr>
+      </w:pPr>
+      <w:r>
+        <w:rPr>
+          <w:b/>
+          <w:bCs/>
+        </w:rPr>
         <w:t xml:space="preserve">Not a claim that the amygdala is uninvolved in emotion.</w:t>
       </w:r>
       <w:r>
@@ -4481,8 +4831,8 @@
         </w:pict>
       </w:r>
     </w:p>
-    <w:bookmarkEnd w:id="29"/>
-    <w:bookmarkStart w:id="30" w:name="ethics"/>
+    <w:bookmarkEnd w:id="30"/>
+    <w:bookmarkStart w:id="31" w:name="ethics"/>
     <w:p>
       <w:pPr>
         <w:pStyle w:val="Heading2"/>
@@ -4523,8 +4873,8 @@
         <w:t xml:space="preserve">consent.</w:t>
       </w:r>
     </w:p>
-    <w:bookmarkEnd w:id="30"/>
-    <w:bookmarkStart w:id="31" w:name="data-code-availability"/>
+    <w:bookmarkEnd w:id="31"/>
+    <w:bookmarkStart w:id="32" w:name="data-code-availability"/>
     <w:p>
       <w:pPr>
         <w:pStyle w:val="Heading2"/>
@@ -4587,8 +4937,8 @@
         <w:t xml:space="preserve">at Zenodo (doi:10.5281/zenodo.21367398).</w:t>
       </w:r>
     </w:p>
-    <w:bookmarkEnd w:id="31"/>
-    <w:bookmarkStart w:id="32" w:name="competing-interests"/>
+    <w:bookmarkEnd w:id="32"/>
+    <w:bookmarkStart w:id="33" w:name="competing-interests"/>
     <w:p>
       <w:pPr>
         <w:pStyle w:val="Heading2"/>
@@ -4605,8 +4955,8 @@
         <w:t xml:space="preserve">The author declares no competing interests.</w:t>
       </w:r>
     </w:p>
-    <w:bookmarkEnd w:id="32"/>
-    <w:bookmarkStart w:id="33" w:name="funding"/>
+    <w:bookmarkEnd w:id="33"/>
+    <w:bookmarkStart w:id="34" w:name="funding"/>
     <w:p>
       <w:pPr>
         <w:pStyle w:val="Heading2"/>
@@ -4623,8 +4973,8 @@
         <w:t xml:space="preserve">This research received no external funding.</w:t>
       </w:r>
     </w:p>
-    <w:bookmarkEnd w:id="33"/>
-    <w:bookmarkStart w:id="34" w:name="use-of-ai"/>
+    <w:bookmarkEnd w:id="34"/>
+    <w:bookmarkStart w:id="35" w:name="use-of-ai"/>
     <w:p>
       <w:pPr>
         <w:pStyle w:val="Heading2"/>
@@ -4659,8 +5009,8 @@
         <w:t xml:space="preserve">author takes full responsibility for the content.</w:t>
       </w:r>
     </w:p>
-    <w:bookmarkEnd w:id="34"/>
-    <w:bookmarkStart w:id="35" w:name="author-note-on-scope"/>
+    <w:bookmarkEnd w:id="35"/>
+    <w:bookmarkStart w:id="36" w:name="author-note-on-scope"/>
     <w:p>
       <w:pPr>
         <w:pStyle w:val="Heading2"/>
@@ -4702,8 +5052,8 @@
         </w:pict>
       </w:r>
     </w:p>
-    <w:bookmarkEnd w:id="35"/>
-    <w:bookmarkStart w:id="48" w:name="figure-legends"/>
+    <w:bookmarkEnd w:id="36"/>
+    <w:bookmarkStart w:id="49" w:name="figure-legends"/>
     <w:p>
       <w:pPr>
         <w:pStyle w:val="Heading2"/>
@@ -4721,18 +5071,18 @@
           <wp:inline>
             <wp:extent cx="5334000" cy="1946881"/>
             <wp:effectExtent b="0" l="0" r="0" t="0"/>
-            <wp:docPr descr="" title="" id="37" name="Picture"/>
+            <wp:docPr descr="" title="" id="38" name="Picture"/>
             <a:graphic>
               <a:graphicData uri="http://schemas.openxmlformats.org/drawingml/2006/picture">
                 <pic:pic>
                   <pic:nvPicPr>
-                    <pic:cNvPr descr="/Users/patrickiben/Documents/Research_Explorations/amygdala-invariance/figures/Fig1_four_modality.png" id="38" name="Picture"/>
+                    <pic:cNvPr descr="/Users/patrickiben/Documents/Research_Explorations/amygdala-invariance/figures/Fig1_four_modality.png" id="39" name="Picture"/>
                     <pic:cNvPicPr>
                       <a:picLocks noChangeArrowheads="1" noChangeAspect="1"/>
                     </pic:cNvPicPr>
                   </pic:nvPicPr>
                   <pic:blipFill>
-                    <a:blip r:embed="rId36"/>
+                    <a:blip r:embed="rId37"/>
                     <a:stretch>
                       <a:fillRect/>
                     </a:stretch>
@@ -4872,18 +5222,18 @@
           <wp:inline>
             <wp:extent cx="5334000" cy="1922393"/>
             <wp:effectExtent b="0" l="0" r="0" t="0"/>
-            <wp:docPr descr="" title="" id="40" name="Picture"/>
+            <wp:docPr descr="" title="" id="41" name="Picture"/>
             <a:graphic>
               <a:graphicData uri="http://schemas.openxmlformats.org/drawingml/2006/picture">
                 <pic:pic>
                   <pic:nvPicPr>
-                    <pic:cNvPr descr="/Users/patrickiben/Documents/Research_Explorations/amygdala-invariance/figures/Fig2_TOST_bounded_null.png" id="41" name="Picture"/>
+                    <pic:cNvPr descr="/Users/patrickiben/Documents/Research_Explorations/amygdala-invariance/figures/Fig2_TOST_bounded_null.png" id="42" name="Picture"/>
                     <pic:cNvPicPr>
                       <a:picLocks noChangeArrowheads="1" noChangeAspect="1"/>
                     </pic:cNvPicPr>
                   </pic:nvPicPr>
                   <pic:blipFill>
-                    <a:blip r:embed="rId39"/>
+                    <a:blip r:embed="rId40"/>
                     <a:stretch>
                       <a:fillRect/>
                     </a:stretch>
@@ -4999,18 +5349,18 @@
           <wp:inline>
             <wp:extent cx="5334000" cy="3243072"/>
             <wp:effectExtent b="0" l="0" r="0" t="0"/>
-            <wp:docPr descr="" title="" id="43" name="Picture"/>
+            <wp:docPr descr="" title="" id="44" name="Picture"/>
             <a:graphic>
               <a:graphicData uri="http://schemas.openxmlformats.org/drawingml/2006/picture">
                 <pic:pic>
                   <pic:nvPicPr>
-                    <pic:cNvPr descr="/Users/patrickiben/Documents/Research_Explorations/amygdala-invariance/figures/Fig3_two_encoder_convergence.png" id="44" name="Picture"/>
+                    <pic:cNvPr descr="/Users/patrickiben/Documents/Research_Explorations/amygdala-invariance/figures/Fig3_two_encoder_convergence.png" id="45" name="Picture"/>
                     <pic:cNvPicPr>
                       <a:picLocks noChangeArrowheads="1" noChangeAspect="1"/>
                     </pic:cNvPicPr>
                   </pic:nvPicPr>
                   <pic:blipFill>
-                    <a:blip r:embed="rId42"/>
+                    <a:blip r:embed="rId43"/>
                     <a:stretch>
                       <a:fillRect/>
                     </a:stretch>
@@ -5124,18 +5474,18 @@
           <wp:inline>
             <wp:extent cx="5334000" cy="2354623"/>
             <wp:effectExtent b="0" l="0" r="0" t="0"/>
-            <wp:docPr descr="" title="" id="46" name="Picture"/>
+            <wp:docPr descr="" title="" id="47" name="Picture"/>
             <a:graphic>
               <a:graphicData uri="http://schemas.openxmlformats.org/drawingml/2006/picture">
                 <pic:pic>
                   <pic:nvPicPr>
-                    <pic:cNvPr descr="/Users/patrickiben/Documents/Research_Explorations/amygdala-invariance/figures/Fig4_positive_account.png" id="47" name="Picture"/>
+                    <pic:cNvPr descr="/Users/patrickiben/Documents/Research_Explorations/amygdala-invariance/figures/Fig4_positive_account.png" id="48" name="Picture"/>
                     <pic:cNvPicPr>
                       <a:picLocks noChangeArrowheads="1" noChangeAspect="1"/>
                     </pic:cNvPicPr>
                   </pic:nvPicPr>
                   <pic:blipFill>
-                    <a:blip r:embed="rId45"/>
+                    <a:blip r:embed="rId46"/>
                     <a:stretch>
                       <a:fillRect/>
                     </a:stretch>
@@ -5220,8 +5570,58 @@
         <w:t xml:space="preserve">time (decision effort).</w:t>
       </w:r>
     </w:p>
-    <w:bookmarkEnd w:id="48"/>
-    <w:bookmarkStart w:id="49" w:name="references"/>
+    <w:p>
+      <w:pPr>
+        <w:pStyle w:val="BodyText"/>
+      </w:pPr>
+      <w:r>
+        <w:rPr>
+          <w:b/>
+          <w:bCs/>
+        </w:rPr>
+        <w:t xml:space="preserve">Figure S1 (supplementary). Specification-curve: the single-neuron verdict is stable across the multiverse of</w:t>
+      </w:r>
+      <w:r>
+        <w:rPr>
+          <w:b/>
+          <w:bCs/>
+        </w:rPr>
+        <w:t xml:space="preserve"> </w:t>
+      </w:r>
+      <w:r>
+        <w:rPr>
+          <w:b/>
+          <w:bCs/>
+        </w:rPr>
+        <w:t xml:space="preserve">defensible analytic choices.</w:t>
+      </w:r>
+      <w:r>
+        <w:t xml:space="preserve"> </w:t>
+      </w:r>
+      <w:r>
+        <w:t xml:space="preserve">The amygdala affect(best)−object(best) contrast, sorted, across 136 defensible</w:t>
+      </w:r>
+      <w:r>
+        <w:t xml:space="preserve"> </w:t>
+      </w:r>
+      <w:r>
+        <w:t xml:space="preserve">specifications (encoder set, best-of aggregation, RDM metric, neural normalization) for the pooled and left-amygdala</w:t>
+      </w:r>
+      <w:r>
+        <w:t xml:space="preserve"> </w:t>
+      </w:r>
+      <w:r>
+        <w:t xml:space="preserve">samples. Every specification is ≤ 0 (vermillion): the negative does not depend on any single analytic choice. The</w:t>
+      </w:r>
+      <w:r>
+        <w:t xml:space="preserve"> </w:t>
+      </w:r>
+      <w:r>
+        <w:t xml:space="preserve">only large mover is hemisphere (the right amygdala is null; reported separately, not shown here).</w:t>
+      </w:r>
+    </w:p>
+    <w:bookmarkEnd w:id="49"/>
+    <w:bookmarkStart w:id="50" w:name="references"/>
     <w:p>
       <w:pPr>
         <w:pStyle w:val="Heading2"/>
@@ -5762,8 +6162,8 @@
         <w:t xml:space="preserve">2025;12:684. doi:10.1038/s41597-025-04803-5.</w:t>
       </w:r>
     </w:p>
-    <w:bookmarkEnd w:id="49"/>
     <w:bookmarkEnd w:id="50"/>
+    <w:bookmarkEnd w:id="51"/>
     <w:sectPr>
       <w:footnotePr>
         <w:numRestart w:val="eachSect"/>

</xml_diff>

<commit_message>
Release v1.3.1: pre-submission referee-panel fixes (framing, df reporting, deposit hygiene)
Co-Authored-By: Claude Opus 4.8 <noreply@anthropic.com>
</commit_message>
<xml_diff>
--- a/manuscript/MANUSCRIPT_amygdala-false-floor_v2.docx
+++ b/manuscript/MANUSCRIPT_amygdala-false-floor_v2.docx
@@ -127,13 +127,25 @@
         <w:t xml:space="preserve"> </w:t>
       </w:r>
       <w:r>
-        <w:t xml:space="preserve">object encoder (+0.0009; significant but about ten times smaller than in fusiform), which a second affect encoder</w:t>
-      </w:r>
-      <w:r>
-        <w:t xml:space="preserve"> </w:t>
-      </w:r>
-      <w:r>
-        <w:t xml:space="preserve">does not reproduce and on which the two affect encoders do not reliably converge. Fusiform (vision) and superior</w:t>
+        <w:t xml:space="preserve">object encoder (+0.0009; significant, about ten times smaller than in fusiform, and robust even to the strongest</w:t>
+      </w:r>
+      <w:r>
+        <w:t xml:space="preserve"> </w:t>
+      </w:r>
+      <w:r>
+        <w:t xml:space="preserve">generic encoder, DINOv2), but a second affect encoder does not reproduce it and the two affect encoders do not</w:t>
+      </w:r>
+      <w:r>
+        <w:t xml:space="preserve"> </w:t>
+      </w:r>
+      <w:r>
+        <w:t xml:space="preserve">converge: it meets the invariance test’s first criterion yet fails the second — an encoder-specific, not</w:t>
+      </w:r>
+      <w:r>
+        <w:t xml:space="preserve"> </w:t>
+      </w:r>
+      <w:r>
+        <w:t xml:space="preserve">construct-invariant, signal. Fusiform (vision) and superior</w:t>
       </w:r>
       <w:r>
         <w:t xml:space="preserve"> </w:t>
@@ -330,6 +342,381 @@
         <w:t xml:space="preserve">2. Results</w:t>
       </w:r>
     </w:p>
+    <w:p>
+      <w:pPr>
+        <w:pStyle w:val="FirstParagraph"/>
+      </w:pPr>
+      <w:r>
+        <w:rPr>
+          <w:b/>
+          <w:bCs/>
+        </w:rPr>
+        <w:t xml:space="preserve">Encoders (cast).</w:t>
+      </w:r>
+      <w:r>
+        <w:t xml:space="preserve"> </w:t>
+      </w:r>
+      <w:r>
+        <w:t xml:space="preserve">The same networks recur across arms under consistent names; code aliases appear in Methods and the deposit.</w:t>
+      </w:r>
+    </w:p>
+    <w:tbl>
+      <w:tblPr>
+        <w:tblStyle w:val="Table"/>
+        <w:tblW w:type="pct" w:w="5000"/>
+        <w:tblLayout w:type="fixed"/>
+        <w:tblLook w:firstRow="1" w:lastRow="0" w:firstColumn="0" w:lastColumn="0" w:noHBand="0" w:noVBand="0" w:val="0020"/>
+      </w:tblPr>
+      <w:tblGrid>
+        <w:gridCol w:w="1980"/>
+        <w:gridCol w:w="1980"/>
+        <w:gridCol w:w="1980"/>
+        <w:gridCol w:w="1980"/>
+      </w:tblGrid>
+      <w:tr>
+        <w:trPr>
+          <w:tblHeader w:val="on"/>
+        </w:trPr>
+        <w:tc>
+          <w:tcPr/>
+          <w:p>
+            <w:pPr>
+              <w:pStyle w:val="Compact"/>
+            </w:pPr>
+            <w:r>
+              <w:t xml:space="preserve">Encoder (code alias)</w:t>
+            </w:r>
+          </w:p>
+        </w:tc>
+        <w:tc>
+          <w:tcPr/>
+          <w:p>
+            <w:pPr>
+              <w:pStyle w:val="Compact"/>
+            </w:pPr>
+            <w:r>
+              <w:t xml:space="preserve">Type</w:t>
+            </w:r>
+          </w:p>
+        </w:tc>
+        <w:tc>
+          <w:tcPr/>
+          <w:p>
+            <w:pPr>
+              <w:pStyle w:val="Compact"/>
+            </w:pPr>
+            <w:r>
+              <w:t xml:space="preserve">Objective</w:t>
+            </w:r>
+          </w:p>
+        </w:tc>
+        <w:tc>
+          <w:tcPr/>
+          <w:p>
+            <w:pPr>
+              <w:pStyle w:val="Compact"/>
+            </w:pPr>
+            <w:r>
+              <w:t xml:space="preserve">Role in the invariance test</w:t>
+            </w:r>
+          </w:p>
+        </w:tc>
+      </w:tr>
+      <w:tr>
+        <w:tc>
+          <w:tcPr/>
+          <w:p>
+            <w:pPr>
+              <w:pStyle w:val="Compact"/>
+            </w:pPr>
+            <w:r>
+              <w:t xml:space="preserve">EmoNet / scene-affect encoder (</w:t>
+            </w:r>
+            <w:r>
+              <w:rPr>
+                <w:rStyle w:val="VerbatimChar"/>
+              </w:rPr>
+              <w:t xml:space="preserve">kragelEmoNet</w:t>
+            </w:r>
+            <w:r>
+              <w:t xml:space="preserve">)</w:t>
+            </w:r>
+          </w:p>
+        </w:tc>
+        <w:tc>
+          <w:tcPr/>
+          <w:p>
+            <w:pPr>
+              <w:pStyle w:val="Compact"/>
+            </w:pPr>
+            <w:r>
+              <w:t xml:space="preserve">affect</w:t>
+            </w:r>
+          </w:p>
+        </w:tc>
+        <w:tc>
+          <w:tcPr/>
+          <w:p>
+            <w:pPr>
+              <w:pStyle w:val="Compact"/>
+            </w:pPr>
+            <w:r>
+              <w:t xml:space="preserve">scene-emotion classification [3]</w:t>
+            </w:r>
+          </w:p>
+        </w:tc>
+        <w:tc>
+          <w:tcPr/>
+          <w:p>
+            <w:pPr>
+              <w:pStyle w:val="Compact"/>
+            </w:pPr>
+            <w:r>
+              <w:t xml:space="preserve">primary construct encoder</w:t>
+            </w:r>
+          </w:p>
+        </w:tc>
+      </w:tr>
+      <w:tr>
+        <w:tc>
+          <w:tcPr/>
+          <w:p>
+            <w:pPr>
+              <w:pStyle w:val="Compact"/>
+            </w:pPr>
+            <w:r>
+              <w:t xml:space="preserve">Face-affect encoder (</w:t>
+            </w:r>
+            <w:r>
+              <w:rPr>
+                <w:rStyle w:val="VerbatimChar"/>
+              </w:rPr>
+              <w:t xml:space="preserve">faceEmoNet</w:t>
+            </w:r>
+            <w:r>
+              <w:t xml:space="preserve">)</w:t>
+            </w:r>
+          </w:p>
+        </w:tc>
+        <w:tc>
+          <w:tcPr/>
+          <w:p>
+            <w:pPr>
+              <w:pStyle w:val="Compact"/>
+            </w:pPr>
+            <w:r>
+              <w:t xml:space="preserve">affect</w:t>
+            </w:r>
+          </w:p>
+        </w:tc>
+        <w:tc>
+          <w:tcPr/>
+          <w:p>
+            <w:pPr>
+              <w:pStyle w:val="Compact"/>
+            </w:pPr>
+            <w:r>
+              <w:t xml:space="preserve">face valence/arousal [9]</w:t>
+            </w:r>
+          </w:p>
+        </w:tc>
+        <w:tc>
+          <w:tcPr/>
+          <w:p>
+            <w:pPr>
+              <w:pStyle w:val="Compact"/>
+            </w:pPr>
+            <w:r>
+              <w:t xml:space="preserve">second construct encoder (criterion B)</w:t>
+            </w:r>
+          </w:p>
+        </w:tc>
+      </w:tr>
+      <w:tr>
+        <w:tc>
+          <w:tcPr/>
+          <w:p>
+            <w:pPr>
+              <w:pStyle w:val="Compact"/>
+            </w:pPr>
+            <w:r>
+              <w:t xml:space="preserve">ResNet-50, ViT-B/16</w:t>
+            </w:r>
+          </w:p>
+        </w:tc>
+        <w:tc>
+          <w:tcPr/>
+          <w:p>
+            <w:pPr>
+              <w:pStyle w:val="Compact"/>
+            </w:pPr>
+            <w:r>
+              <w:t xml:space="preserve">object</w:t>
+            </w:r>
+          </w:p>
+        </w:tc>
+        <w:tc>
+          <w:tcPr/>
+          <w:p>
+            <w:pPr>
+              <w:pStyle w:val="Compact"/>
+            </w:pPr>
+            <w:r>
+              <w:t xml:space="preserve">ImageNet object recognition</w:t>
+            </w:r>
+          </w:p>
+        </w:tc>
+        <w:tc>
+          <w:tcPr/>
+          <w:p>
+            <w:pPr>
+              <w:pStyle w:val="Compact"/>
+            </w:pPr>
+            <w:r>
+              <w:t xml:space="preserve">capacity-matched non-construct baseline</w:t>
+            </w:r>
+          </w:p>
+        </w:tc>
+      </w:tr>
+      <w:tr>
+        <w:tc>
+          <w:tcPr/>
+          <w:p>
+            <w:pPr>
+              <w:pStyle w:val="Compact"/>
+            </w:pPr>
+            <w:r>
+              <w:t xml:space="preserve">DINOv2, CLIP</w:t>
+            </w:r>
+          </w:p>
+        </w:tc>
+        <w:tc>
+          <w:tcPr/>
+          <w:p>
+            <w:pPr>
+              <w:pStyle w:val="Compact"/>
+            </w:pPr>
+            <w:r>
+              <w:t xml:space="preserve">generic</w:t>
+            </w:r>
+          </w:p>
+        </w:tc>
+        <w:tc>
+          <w:tcPr/>
+          <w:p>
+            <w:pPr>
+              <w:pStyle w:val="Compact"/>
+            </w:pPr>
+            <w:r>
+              <w:t xml:space="preserve">self-distilled / contrastive vision</w:t>
+            </w:r>
+          </w:p>
+        </w:tc>
+        <w:tc>
+          <w:tcPr/>
+          <w:p>
+            <w:pPr>
+              <w:pStyle w:val="Compact"/>
+            </w:pPr>
+            <w:r>
+              <w:t xml:space="preserve">strong-baseline non-construct (red-team)</w:t>
+            </w:r>
+          </w:p>
+        </w:tc>
+      </w:tr>
+      <w:tr>
+        <w:tc>
+          <w:tcPr/>
+          <w:p>
+            <w:pPr>
+              <w:pStyle w:val="Compact"/>
+            </w:pPr>
+            <w:r>
+              <w:t xml:space="preserve">Low-level</w:t>
+            </w:r>
+          </w:p>
+        </w:tc>
+        <w:tc>
+          <w:tcPr/>
+          <w:p>
+            <w:pPr>
+              <w:pStyle w:val="Compact"/>
+            </w:pPr>
+            <w:r>
+              <w:t xml:space="preserve">low-level</w:t>
+            </w:r>
+          </w:p>
+        </w:tc>
+        <w:tc>
+          <w:tcPr/>
+          <w:p>
+            <w:pPr>
+              <w:pStyle w:val="Compact"/>
+            </w:pPr>
+            <w:r>
+              <w:t xml:space="preserve">Gabor / luminance / motion</w:t>
+            </w:r>
+          </w:p>
+        </w:tc>
+        <w:tc>
+          <w:tcPr/>
+          <w:p>
+            <w:pPr>
+              <w:pStyle w:val="Compact"/>
+            </w:pPr>
+            <w:r>
+              <w:t xml:space="preserve">non-construct floor</w:t>
+            </w:r>
+          </w:p>
+        </w:tc>
+      </w:tr>
+      <w:tr>
+        <w:tc>
+          <w:tcPr/>
+          <w:p>
+            <w:pPr>
+              <w:pStyle w:val="Compact"/>
+            </w:pPr>
+            <w:r>
+              <w:t xml:space="preserve">wav2vec2 (audio)</w:t>
+            </w:r>
+          </w:p>
+        </w:tc>
+        <w:tc>
+          <w:tcPr/>
+          <w:p>
+            <w:pPr>
+              <w:pStyle w:val="Compact"/>
+            </w:pPr>
+            <w:r>
+              <w:t xml:space="preserve">affect</w:t>
+            </w:r>
+          </w:p>
+        </w:tc>
+        <w:tc>
+          <w:tcPr/>
+          <w:p>
+            <w:pPr>
+              <w:pStyle w:val="Compact"/>
+            </w:pPr>
+            <w:r>
+              <w:t xml:space="preserve">speech-emotion (audio arm) [13]</w:t>
+            </w:r>
+          </w:p>
+        </w:tc>
+        <w:tc>
+          <w:tcPr/>
+          <w:p>
+            <w:pPr>
+              <w:pStyle w:val="Compact"/>
+            </w:pPr>
+            <w:r>
+              <w:t xml:space="preserve">construct encoder (audio)</w:t>
+            </w:r>
+          </w:p>
+        </w:tc>
+      </w:tr>
+    </w:tbl>
     <w:bookmarkStart w:id="11" w:name="Xe93f7482d0a87ee2fdeacdda7a6ca2527a14a7b"/>
     <w:p>
       <w:pPr>
@@ -1717,31 +2104,129 @@
         <w:t xml:space="preserve"> </w:t>
       </w:r>
       <w:r>
-        <w:t xml:space="preserve">rather than a reversal of consensus. We state the scope carefully, and it is why we scope the title</w:t>
-      </w:r>
-      <w:r>
-        <w:t xml:space="preserve"> </w:t>
-      </w:r>
-      <w:r>
-        <w:t xml:space="preserve">to the left amygdala: across the fMRI arms the amygdala bilaterally carries no reliable emotion-encoder-specific,</w:t>
-      </w:r>
-      <w:r>
-        <w:t xml:space="preserve"> </w:t>
-      </w:r>
-      <w:r>
-        <w:t xml:space="preserve">image-computable code of the kind sensory cortex carries, but the strongest, correction-robust positive evidence</w:t>
-      </w:r>
-      <w:r>
-        <w:t xml:space="preserve"> </w:t>
-      </w:r>
-      <w:r>
-        <w:t xml:space="preserve">that generic object and low-level encoders match its single-neuron geometry better than affect encoders is</w:t>
-      </w:r>
-      <w:r>
-        <w:t xml:space="preserve"> </w:t>
-      </w:r>
-      <w:r>
-        <w:t xml:space="preserve">left-lateralized (the right amygdala shows no affect-object difference in either direction). This is not a claim</w:t>
+        <w:t xml:space="preserve">rather than a reversal of consensus. Soderberg et al. localize the facial-emotion code to cortical face and</w:t>
+      </w:r>
+      <w:r>
+        <w:t xml:space="preserve"> </w:t>
+      </w:r>
+      <w:r>
+        <w:t xml:space="preserve">visual-context regions with fMRI; they do not test the amygdala at single-neuron resolution, do not include</w:t>
+      </w:r>
+      <w:r>
+        <w:t xml:space="preserve"> </w:t>
+      </w:r>
+      <w:r>
+        <w:t xml:space="preserve">audition, and do not apply a two-encoder capacity-matched invariance criterion, and Jang &amp; Kragel’s (2025) amygdala</w:t>
+      </w:r>
+      <w:r>
+        <w:t xml:space="preserve"> </w:t>
+      </w:r>
+      <w:r>
+        <w:t xml:space="preserve">positive remains unretracted — so the present single-neuron anchor and the invariance protocol are a distinct,</w:t>
+      </w:r>
+      <w:r>
+        <w:t xml:space="preserve"> </w:t>
+      </w:r>
+      <w:r>
+        <w:t xml:space="preserve">non-redundant contribution rather than a restatement of that work. We state the scope carefully, and it is why we scope the title</w:t>
+      </w:r>
+      <w:r>
+        <w:t xml:space="preserve"> </w:t>
+      </w:r>
+      <w:r>
+        <w:t xml:space="preserve">to the left amygdala: across the fMRI arms the amygdala bilaterally carries no reliable emotion-construct-invariant</w:t>
+      </w:r>
+      <w:r>
+        <w:t xml:space="preserve"> </w:t>
+      </w:r>
+      <w:r>
+        <w:t xml:space="preserve">(cross-encoder-consistent) image-computable code of the kind sensory cortex carries, but the strongest,</w:t>
+      </w:r>
+      <w:r>
+        <w:t xml:space="preserve"> </w:t>
+      </w:r>
+      <w:r>
+        <w:t xml:space="preserve">correction-robust positive evidence that generic object and low-level encoders match its single-neuron geometry</w:t>
+      </w:r>
+      <w:r>
+        <w:t xml:space="preserve"> </w:t>
+      </w:r>
+      <w:r>
+        <w:t xml:space="preserve">better than affect encoders is left-lateralized (the right amygdala shows no affect-object difference in either</w:t>
+      </w:r>
+      <w:r>
+        <w:t xml:space="preserve"> </w:t>
+      </w:r>
+      <w:r>
+        <w:t xml:space="preserve">direction). A note on terms: we use</w:t>
+      </w:r>
+      <w:r>
+        <w:t xml:space="preserve"> </w:t>
+      </w:r>
+      <w:r>
+        <w:rPr>
+          <w:i/>
+          <w:iCs/>
+        </w:rPr>
+        <w:t xml:space="preserve">construct-invariant</w:t>
+      </w:r>
+      <w:r>
+        <w:t xml:space="preserve"> </w:t>
+      </w:r>
+      <w:r>
+        <w:t xml:space="preserve">for the paper’s negative — a code that agrees across</w:t>
+      </w:r>
+      <w:r>
+        <w:t xml:space="preserve"> </w:t>
+      </w:r>
+      <w:r>
+        <w:t xml:space="preserve">paradigmatically different emotion encoders (invariance criterion B) — and reserve</w:t>
+      </w:r>
+      <w:r>
+        <w:t xml:space="preserve"> </w:t>
+      </w:r>
+      <w:r>
+        <w:rPr>
+          <w:i/>
+          <w:iCs/>
+        </w:rPr>
+        <w:t xml:space="preserve">encoder-specific</w:t>
+      </w:r>
+      <w:r>
+        <w:t xml:space="preserve"> </w:t>
+      </w:r>
+      <w:r>
+        <w:t xml:space="preserve">for the</w:t>
+      </w:r>
+      <w:r>
+        <w:t xml:space="preserve"> </w:t>
+      </w:r>
+      <w:r>
+        <w:t xml:space="preserve">weaker property that a single emotion encoder captures a signal (criterion A); the title’s</w:t>
+      </w:r>
+      <w:r>
+        <w:t xml:space="preserve"> </w:t>
+      </w:r>
+      <w:r>
+        <w:t xml:space="preserve">“emotion-specific”</w:t>
+      </w:r>
+      <w:r>
+        <w:t xml:space="preserve"> </w:t>
+      </w:r>
+      <w:r>
+        <w:t xml:space="preserve">denotes the former. This is why the movie left-amygdala EmoNet increment, which meets criterion A (it beats even</w:t>
+      </w:r>
+      <w:r>
+        <w:t xml:space="preserve"> </w:t>
+      </w:r>
+      <w:r>
+        <w:t xml:space="preserve">the strongest generic encoder, DINOv2), is nonetheless not an emotion-specific code: it fails criterion B. This is</w:t>
+      </w:r>
+      <w:r>
+        <w:t xml:space="preserve"> </w:t>
+      </w:r>
+      <w:r>
+        <w:t xml:space="preserve">not a claim</w:t>
       </w:r>
       <w:r>
         <w:t xml:space="preserve"> </w:t>
@@ -1835,7 +2320,19 @@
         <w:t xml:space="preserve"> </w:t>
       </w:r>
       <w:r>
-        <w:t xml:space="preserve">combination as a false-floor guard applied to a specific affective-coding claim. For affective neuroscience,</w:t>
+        <w:t xml:space="preserve">combination as a</w:t>
+      </w:r>
+      <w:r>
+        <w:t xml:space="preserve"> </w:t>
+      </w:r>
+      <w:r>
+        <w:t xml:space="preserve">“false-floor”</w:t>
+      </w:r>
+      <w:r>
+        <w:t xml:space="preserve"> </w:t>
+      </w:r>
+      <w:r>
+        <w:t xml:space="preserve">guard — a construct claim can sit on an apparent floor of signal that any capacity-matched encoder also produces — applied to a specific affective-coding claim. For affective neuroscience,</w:t>
       </w:r>
       <w:r>
         <w:t xml:space="preserve"> </w:t>
@@ -3263,7 +3760,7 @@
         <w:t xml:space="preserve">RandomState(0)</w:t>
       </w:r>
       <w:r>
-        <w:t xml:space="preserve">, B=2000 in the RSA script and B=4000 in the equivalence script), recomputing the pseudo-population RSA to give percentile 95% CIs; the affect-object statistic per bootstrap was ao = max(faceEmoNet, kragelEmoNet) - max(resnet, vit), with a two-sided bootstrap p = 2*min(mean(ao &lt;= 0), mean(ao &gt;= 0)). The per-session group test, which respects the nesting of units within sessions and is the primary inference, computed the pseudo-population RSA within each of the 20 (of 22) sessions that had at least 3 units and applied a one-sample t versus 0 across sessions (</w:t>
+        <w:t xml:space="preserve">, B=2000 in the RSA script and B=4000 in the equivalence script), recomputing the pseudo-population RSA to give percentile 95% CIs; the affect-object statistic per bootstrap was ao = max(faceEmoNet, kragelEmoNet) - max(resnet, vit), with a two-sided bootstrap p = 2*min(mean(ao &lt;= 0), mean(ao &gt;= 0)). The per-session group test, which respects the nesting of units within sessions and is the primary inference, computed the pseudo-population RSA within each session that had at least 3 units in the region tested and applied a one-sample t versus 0 across sessions (</w:t>
       </w:r>
       <w:r>
         <w:rPr>
@@ -3278,7 +3775,7 @@
         <w:t xml:space="preserve">‘omit’</w:t>
       </w:r>
       <w:r>
-        <w:t xml:space="preserve">); encoder-contrast pairs tested were faceEmoNet-resnet, kragelEmoNet-resnet, faceEmoNet-vit, and kragelEmoNet-vit. The same procedure was run for all amygdala units, left-only, right-only, and the MFC (ACC+SMA) comparison region.</w:t>
+        <w:t xml:space="preserve">); encoder-contrast pairs tested were faceEmoNet-resnet, kragelEmoNet-resnet, faceEmoNet-vit, and kragelEmoNet-vit. The same procedure was run for all amygdala units, left-only, right-only, and the MFC (ACC+SMA) comparison region; because the ≥3-units criterion is applied within each hemisphere for the split tests, the effective session counts (and degrees of freedom) are: pooled amygdala 20 of 22 sessions (df=19), left amygdala 14 (df=13), right amygdala 12 (df=11), and MFC 15 (df=14). Thus the correction-robust left-amygdala anchor (faceEmoNet-resnet −0.089, t=−5.04) is a df=13 test.</w:t>
       </w:r>
     </w:p>
     <w:p>
@@ -5220,7 +5717,7 @@
       <w:r>
         <w:drawing>
           <wp:inline>
-            <wp:extent cx="5334000" cy="1922393"/>
+            <wp:extent cx="5334000" cy="2900743"/>
             <wp:effectExtent b="0" l="0" r="0" t="0"/>
             <wp:docPr descr="" title="" id="41" name="Picture"/>
             <a:graphic>
@@ -5241,7 +5738,7 @@
                   <pic:spPr bwMode="auto">
                     <a:xfrm>
                       <a:off x="0" y="0"/>
-                      <a:ext cx="5334000" cy="1922393"/>
+                      <a:ext cx="5334000" cy="2900743"/>
                     </a:xfrm>
                     <a:prstGeom prst="rect">
                       <a:avLst/>

</xml_diff>